<commit_message>
Toán 12 STEM Thiết kế hộp: đổi nơi nộp sản phẩm sang nhóm Zalo của lớp (KHBD, bản hoà nhập, KHDH HS khuyết tật)
Co-Authored-By: Claude Opus 5.5 <noreply@anthropic.com>
</commit_message>
<xml_diff>
--- a/mon/toan/khbd/lop12/KHBD_TOAN12_STEM_ThietKeHop_T21-22.docx
+++ b/mon/toan/khbd/lop12/KHBD_TOAN12_STEM_ThietKeHop_T21-22.docx
@@ -1560,7 +1560,7 @@
                 <w:rFonts w:ascii="Times New Roman" w:hAnsi="Times New Roman" w:eastAsia="Times New Roman" w:cs="Times New Roman"/>
                 <w:sz w:val="24"/>
               </w:rPr>
-              <w:t>); dụng cụ cắt, gấp, dán; chatbot AI giải toán từng bước (có kiểm chứng); Google Classroom/Padlet.</w:t>
+              <w:t>); dụng cụ cắt, gấp, dán; chatbot AI giải toán từng bước (có kiểm chứng); nhóm Zalo của lớp.</w:t>
             </w:r>
           </w:p>
         </w:tc>
@@ -6387,7 +6387,7 @@
           <w:rFonts w:ascii="Times New Roman" w:hAnsi="Times New Roman" w:eastAsia="Times New Roman" w:cs="Times New Roman"/>
           <w:sz w:val="24"/>
         </w:rPr>
-        <w:t xml:space="preserve"> GV giao nhiệm vụ hoàn thiện sản phẩm theo bản thiết kế đã duyệt; nhắc yêu cầu an toàn, thời hạn nộp ảnh, video lên Classroom/Padlet.</w:t>
+        <w:t xml:space="preserve"> GV giao nhiệm vụ hoàn thiện sản phẩm theo bản thiết kế đã duyệt; nhắc yêu cầu an toàn, thời hạn nộp ảnh, video lên nhóm Zalo của lớp.</w:t>
       </w:r>
     </w:p>
     <w:p>
@@ -6447,7 +6447,7 @@
           <w:rFonts w:ascii="Times New Roman" w:hAnsi="Times New Roman" w:eastAsia="Times New Roman" w:cs="Times New Roman"/>
           <w:sz w:val="24"/>
         </w:rPr>
-        <w:t xml:space="preserve"> GV theo dõi tiến độ qua nhóm Zalo/Classroom, trả lời thắc mắc, góp ý bản nháp slide.</w:t>
+        <w:t xml:space="preserve"> GV theo dõi tiến độ qua nhóm Zalo của lớp, trả lời thắc mắc, góp ý bản nháp slide.</w:t>
       </w:r>
     </w:p>
     <w:p>

</xml_diff>